<commit_message>
Reorganiza em comum/ + pesquisas; adiciona Pesquisa 2: deveres sociais ensinados por Jesus
- comum/preparar_dados.py + biblia.py: fontes e dados compartilhados (MorphGNT, WEB \wj, Strong's)
- pesquisa-1-imperativos/: extrair_imperativos.py + construir.py + dados + docs (saída idêntica à anterior)
- pesquisa-2-deveres-sociais/: leitura integral das 1.955 falas de Jesus; 384 versículos julgados
  (tipo, força, destinatário, detalhe prático); 14 categorias priorizadas; mapa de atividades da ONG;
  documento institucional, planilha de achados, metodologia e observações
- corrige sombreamento de ROOT pelo star-import de timbrado

Co-Authored-By: Claude Fable 5.1 <noreply@anthropic.com>
</commit_message>
<xml_diff>
--- a/pesquisa-1-imperativos/docs/Projeto_e_Metodologia.docx
+++ b/pesquisa-1-imperativos/docs/Projeto_e_Metodologia.docx
@@ -2043,7 +2043,7 @@
           <w:i w:val="0"/>
           <w:sz w:val="19"/>
         </w:rPr>
-        <w:t>dados/ e construir.py — dados brutos, rótulos e código que regenera tudo.</w:t>
+        <w:t>comum/, pesquisa-1-imperativos/dados/ e construir.py — dados brutos, rótulos e código que regenera tudo.</w:t>
       </w:r>
     </w:p>
     <w:p>
@@ -2087,7 +2087,7 @@
           <w:i w:val="0"/>
           <w:sz w:val="19"/>
         </w:rPr>
-        <w:t>No repositório: `python3 preparar_dados.py` baixa o MorphGNT, a WEB e o dicionário de Strong e gera os arquivos intermediários; `python3 construir.py` aplica os rótulos (dados/rotulos.py), o glossário, o complemento e a taxonomia e produz a planilha e os documentos. Alterar um julgamento é editar uma linha em rotulos.py e rodar de novo.</w:t>
+        <w:t>No repositório: `python3 comum/preparar_dados.py` baixa o MorphGNT, a WEB e o dicionário de Strong e gera os arquivos comuns; `python3 pesquisa-1-imperativos/extrair_imperativos.py` extrai os imperativos; `python3 pesquisa-1-imperativos/construir.py` aplica os rótulos (dados/rotulos.py), o glossário, o complemento e a taxonomia e produz a planilha e os documentos. Alterar um julgamento é editar uma linha em rotulos.py e rodar de novo.</w:t>
       </w:r>
     </w:p>
     <w:sectPr>

</xml_diff>